<commit_message>
Feat: Complete fully adaptive dual-tooltip crosshair and financial dashboard for stock vs fund comparator
</commit_message>
<xml_diff>
--- a/基金網頁.docx
+++ b/基金網頁.docx
@@ -29,11 +29,6 @@
     </w:p>
     <w:p/>
     <w:p>
-      <w:pPr>
-        <w:rPr>
-          <w:rFonts w:hint="eastAsia"/>
-        </w:rPr>
-      </w:pPr>
       <w:r>
         <w:t>https://www.moneydj.com/funddj/bcd/tBCDNavList.djbcd?a=ACDD01&amp;B=2025-6-2&amp;C=2026-6-2&amp;D=</w:t>
       </w:r>
@@ -97,14 +92,55 @@
     </w:p>
     <w:p/>
     <w:p>
+      <w:r>
+        <w:t>https://www.moneydj.com/funddj/bcd/tBCDNavList.djbcd?a=ACPS02&amp;B=2025-6-2&amp;C=2026-6-2&amp;D=</w:t>
+      </w:r>
+      <w:r>
+        <w:rPr>
+          <w:rFonts w:hint="eastAsia"/>
+        </w:rPr>
+        <w:t>(</w:t>
+      </w:r>
+      <w:r>
+        <w:t>統一黑馬基金</w:t>
+      </w:r>
+      <w:r>
+        <w:rPr>
+          <w:rFonts w:hint="eastAsia"/>
+        </w:rPr>
+        <w:t>)</w:t>
+      </w:r>
+    </w:p>
+    <w:p/>
+    <w:p/>
+    <w:p>
       <w:pPr>
         <w:rPr>
           <w:rFonts w:hint="eastAsia"/>
         </w:rPr>
       </w:pPr>
-      <w:r>
-        <w:t>https://www.moneydj.com/funddj/bcd/tBCDNavList.djbcd?a=ACPS02&amp;B=2025-6-2&amp;C=2026-6-2&amp;D=</w:t>
-      </w:r>
+      <w:hyperlink r:id="rId5" w:history="1">
+        <w:r>
+          <w:rPr>
+            <w:rStyle w:val="ae"/>
+          </w:rPr>
+          <w:t>https://www.moneydj.com/funddj/djjson/YFundSearchJSON.djjson?q=%E5%AE%89%E8%81%AF</w:t>
+        </w:r>
+      </w:hyperlink>
+      <w:r>
+        <w:br/>
+      </w:r>
+      <w:r>
+        <w:br/>
+      </w:r>
+      <w:hyperlink r:id="rId6" w:history="1">
+        <w:r>
+          <w:rPr>
+            <w:rStyle w:val="ae"/>
+          </w:rPr>
+          <w:t>https://www.moneydj.com/funddj/ya/yFundSearch.djhtm?a=%E5%AE%89%E8%81%AF&amp;B=1&amp;C=0&amp;D=&amp;ff=1</w:t>
+        </w:r>
+      </w:hyperlink>
       <w:r>
         <w:rPr>
           <w:rFonts w:hint="eastAsia"/>
@@ -112,7 +148,42 @@
         <w:t>(</w:t>
       </w:r>
       <w:r>
-        <w:t>統一黑馬基金</w:t>
+        <w:rPr>
+          <w:rFonts w:hint="eastAsia"/>
+        </w:rPr>
+        <w:t>第一頁</w:t>
+      </w:r>
+      <w:r>
+        <w:rPr>
+          <w:rFonts w:hint="eastAsia"/>
+        </w:rPr>
+        <w:t>)</w:t>
+      </w:r>
+      <w:r>
+        <w:br/>
+      </w:r>
+      <w:r>
+        <w:br/>
+      </w:r>
+      <w:hyperlink r:id="rId7" w:history="1">
+        <w:r>
+          <w:rPr>
+            <w:rStyle w:val="ae"/>
+          </w:rPr>
+          <w:t>https://www.moneydj.com/funddj/ya/yFundSearch.djhtm?a=%E5%AE%89%E8%81%AF&amp;B=2&amp;C=0&amp;D=&amp;ff=1</w:t>
+        </w:r>
+      </w:hyperlink>
+      <w:r>
+        <w:rPr>
+          <w:rFonts w:hint="eastAsia"/>
+        </w:rPr>
+        <w:t>(</w:t>
+      </w:r>
+      <w:r>
+        <w:rPr>
+          <w:rFonts w:hint="eastAsia"/>
+        </w:rPr>
+        <w:t>第二頁</w:t>
       </w:r>
       <w:r>
         <w:rPr>

</xml_diff>

<commit_message>
feat: complete tab switching and smart dca backtest
</commit_message>
<xml_diff>
--- a/基金網頁.docx
+++ b/基金網頁.docx
@@ -111,14 +111,15 @@
         <w:t>)</w:t>
       </w:r>
     </w:p>
+    <w:p>
+      <w:r>
+        <w:br/>
+        <w:t>https://www.moneydj.com/funddj/bcd/BCDNavList.djbcd?a=FLZ80&amp;B=2025-6-9&amp;C=2026-6-9&amp;D=</w:t>
+      </w:r>
+    </w:p>
     <w:p/>
     <w:p/>
     <w:p>
-      <w:pPr>
-        <w:rPr>
-          <w:rFonts w:hint="eastAsia"/>
-        </w:rPr>
-      </w:pPr>
       <w:hyperlink r:id="rId5" w:history="1">
         <w:r>
           <w:rPr>

</xml_diff>